<commit_message>
F9 (preparación): paquete revisado contra la PCB (OutJob de las 16:01: Gerber iguales en geometría, 304 taladros, P&P = centro de pads, BOM = P&P = PcbDoc); Word con K1 comprado por PCBWay y costo sin DigiKey
</commit_message>
<xml_diff>
--- a/docs/Descripcion_PCB_EVSE_Monitor.docx
+++ b/docs/Descripcion_PCB_EVSE_Monitor.docx
@@ -2030,19 +2030,19 @@
         <w:rPr>
           <w:b w:val="0"/>
         </w:rPr>
-        <w:t xml:space="preserve">La placa se pide a PCBWay ensamblada (turnkey): PCBWay suelda todas las piezas que tiene en stock, SMD y THT. Solo dos se sueldan a mano: K1, que se compra en DigiKey, y U1, el regulador que facilitó el profesor. El CT, la sonda y la pila van fuera de la placa y se compran en Sigma Electrónica. El costo estimado es de </w:t>
+        <w:t xml:space="preserve">La placa se pide a PCBWay ensamblada (turnkey): PCBWay suelda todas las piezas que tiene en stock, SMD y THT. Lo que no está en su stock lo compra en DigiKey o Mouser, como K1. Solo U1, el regulador que facilitó el profesor, se suelda a mano. El CT, la sonda y la pila van fuera de la placa y se compran en Sigma Electrónica. El costo estimado es de </w:t>
       </w:r>
       <w:r>
         <w:rPr>
           <w:b/>
         </w:rPr>
-        <w:t>US$ 220</w:t>
+        <w:t>US$ 211</w:t>
       </w:r>
       <w:r>
         <w:rPr>
           <w:b w:val="0"/>
         </w:rPr>
-        <w:t xml:space="preserve"> (unos 702.000 COP): US$ 186 en PCBWay (cinco PCB, una ensamblada), US$ 18 en DigiKey y 50.813 COP en Sigma.</w:t>
+        <w:t xml:space="preserve"> (unos 673.000 COP): US$ 196 en PCBWay (cinco PCB, una ensamblada, con dos fusibles de repuesto) y 50.813 COP en Sigma.</w:t>
       </w:r>
     </w:p>
     <w:p>

</xml_diff>